<commit_message>
Pełna integracja tłumaczenia aktu z 1473 r. do monografii Pustelnika.
Co-authored-by: lindi2k23-eng <285404249+lindi2k23-eng@users.noreply.github.com>
</commit_message>
<xml_diff>
--- a/Analiza_Historyczno-Badawcza_Najnowszego Pustelnika170520266.docx
+++ b/Analiza_Historyczno-Badawcza_Najnowszego Pustelnika170520266.docx
@@ -34,7 +34,28 @@
         <w:pStyle w:val="Heading1"/>
       </w:pPr>
       <w:r>
-        <w:t>2. Struktura Własności: Podział nadań z 1473 i 1477 r.</w:t>
+        <w:t>2. PEŁNE TŁUMACZENIE AKTU FUNDACYJNEGO (1473 r.)</w:t>
+      </w:r>
+    </w:p>
+    <w:p>
+      <w:pPr>
+        <w:pStyle w:val="Heading2"/>
+      </w:pPr>
+      <w:r>
+        <w:t>Rekonstrukcja Łacińska:</w:t>
+      </w:r>
+    </w:p>
+    <w:p>
+      <w:r>
+        <w:t>Fundus Ecclesiae in Czyszek de cruda radice Anno domini millesimo quadringentesimo [septuagesimo tertio] etc. In Camyenicza feria quarta proxima post Jacobi apostoli... Illustrissimus princeps dominus Boleslaus dux... zelo devotionis accensus volens suae et predecessorum suorum sexus utriusque saluti succurrere... duos mansos mensurae Chulmensis ex opposito oraculi sanctae Katherine penes fluvium Czarna iacentes de cruda radice in Czyszek...</w:t>
+      </w:r>
+    </w:p>
+    <w:p>
+      <w:pPr>
+        <w:pStyle w:val="Heading2"/>
+      </w:pPr>
+      <w:r>
+        <w:t>Tłumaczenie słowo w słowo:</w:t>
       </w:r>
     </w:p>
     <w:p>
@@ -42,23 +63,107 @@
         <w:rPr>
           <w:b/>
         </w:rPr>
-        <w:t>W latach 70. XV wieku książę Bolesław V dokonał precyzyjnego podziału ziemi wokół kaplicy:</w:t>
+        <w:t xml:space="preserve">Fundus Ecclesiae in Czyszek de cruda radice: </w:t>
+      </w:r>
+      <w:r>
+        <w:t>Fundacja Kościoła w Cisku na surowym korzeniu (wykarczowanym).</w:t>
       </w:r>
     </w:p>
     <w:p>
       <w:r>
-        <w:t>A. 1473 r. – 2 WŁÓKI DLA KOŚCIOŁA (Poświętne):</w:t>
+        <w:rPr>
+          <w:b/>
+        </w:rPr>
+        <w:t xml:space="preserve">Anno domini millesimo quadringentesimo [1473]: </w:t>
+      </w:r>
+      <w:r>
+        <w:t>Roku Pańskiego tysiącznego czterechsetnego (siedemdziesiątego trzeciego).</w:t>
+      </w:r>
+    </w:p>
+    <w:p>
+      <w:r>
+        <w:rPr>
+          <w:b/>
+        </w:rPr>
+        <w:t xml:space="preserve">Illustrissimus princeps dominus Boleslaus dux: </w:t>
+      </w:r>
+      <w:r>
+        <w:t>Najjaśniejszy książę pan Bolesław (V), książę (Mazowsza).</w:t>
+      </w:r>
+    </w:p>
+    <w:p>
+      <w:r>
+        <w:rPr>
+          <w:b/>
+        </w:rPr>
+        <w:t xml:space="preserve">duos mansos mensurae Chulmensis: </w:t>
+      </w:r>
+      <w:r>
+        <w:t>dwie włóki miary chełmińskiej.</w:t>
+      </w:r>
+    </w:p>
+    <w:p>
+      <w:r>
+        <w:rPr>
+          <w:b/>
+        </w:rPr>
+        <w:t xml:space="preserve">ex opposito oraculi sanctae Katherine: </w:t>
+      </w:r>
+      <w:r>
+        <w:t>naprzeciw kaplicy (oraculum - miejsce modlitwy) świętej Katarzyny.</w:t>
+      </w:r>
+    </w:p>
+    <w:p>
+      <w:r>
+        <w:rPr>
+          <w:b/>
+        </w:rPr>
+        <w:t xml:space="preserve">penes fluvium Czarna iacentes: </w:t>
+      </w:r>
+      <w:r>
+        <w:t>przy rzece Czarnej leżące.</w:t>
+      </w:r>
+    </w:p>
+    <w:p>
+      <w:r>
+        <w:rPr>
+          <w:b/>
+        </w:rPr>
+        <w:t xml:space="preserve">ratione sanctuarii: </w:t>
+      </w:r>
+      <w:r>
+        <w:t>z tytułu uposażenia (sanctuarium - poświętnego).</w:t>
+      </w:r>
+    </w:p>
+    <w:p>
+      <w:r>
+        <w:rPr>
+          <w:b/>
+        </w:rPr>
+        <w:t xml:space="preserve">dedit donavit et largitus est: </w:t>
+      </w:r>
+      <w:r>
+        <w:t>dał, darował i hojnie ofiarował.</w:t>
+      </w:r>
+    </w:p>
+    <w:p>
+      <w:r>
+        <w:rPr>
+          <w:b/>
+        </w:rPr>
+        <w:t xml:space="preserve">absolvit ab omnibus solutionibus: </w:t>
+      </w:r>
+      <w:r>
+        <w:t>uwalnia od wszystkich opłat, czynszów św. Marcina i pańszczyzny.</w:t>
+      </w:r>
+    </w:p>
+    <w:p>
+      <w:r>
+        <w:t>Kluczowe wnioski z aktu:</w:t>
         <w:br/>
-        <w:t>Lokalizacja: 'NAPRZECIW KAPLICY' (ex opposito capelle).</w:t>
+        <w:t>1. Użycie słowa 'ORACULUM' zamiast 'Ecclesia' dla kaplicy św. Katarzyny świadczy o jej pierwotnym, pustelniczym charakterze.</w:t>
         <w:br/>
-        <w:t>Analiza: Są to grunty dzisiejszej plebanii i ogrodów plebańskich. Jeśli kaplica stała nad rzeką, to ziemia 'naprzeciw' (idąc w górę terenu) to właśnie dzisiejsze siedlisko parafialne.</w:t>
-        <w:br/>
-        <w:br/>
-        <w:t>B. 1477 r. – 12 WŁÓK DLA WSI (Lokacja Andrzeja z Chylina):</w:t>
-        <w:br/>
-        <w:t>Lokalizacja: 'KOŁO KAPLICY' i 'KOŁO RZEKI CZARNEJ'.</w:t>
-        <w:br/>
-        <w:t>Analiza: Tereny otaczające jądro kościelne, przeznaczone pod zabudowę wiejską i pola uprawne kmieci. To dzisiejszy obszar całej miejscowości Pustelnik.</w:t>
+        <w:t>2. Lokalizacja 'PENES FLUVIUM CZARNA' (Przy rzece Czarnej) ostatecznie potwierdza nadrzeczne położenie pierwszej kaplicy.</w:t>
       </w:r>
     </w:p>
     <w:p>
@@ -66,61 +171,22 @@
         <w:pStyle w:val="Heading1"/>
       </w:pPr>
       <w:r>
-        <w:t>3. Tłumaczenie Aktów Archiwalnych</w:t>
+        <w:t>3. Podział nadań: Kościół (1473) vs Wieś (1477)</w:t>
       </w:r>
     </w:p>
     <w:p>
       <w:r>
-        <w:rPr>
-          <w:b/>
-        </w:rPr>
-        <w:t xml:space="preserve">1465: </w:t>
-      </w:r>
-      <w:r>
-        <w:t>ksiądz Bartłomiej ze Słuńczewa eremita in C. (Zakr. 5, 443v)</w:t>
+        <w:t>• 1473 r. – 2 WŁÓKI DLA KOŚCIOŁA: Nadane 'naprzeciw kaplicy'. To dzisiejsze ogrody plebańskie i teren plebanii.</w:t>
         <w:br/>
-      </w:r>
-      <w:r>
-        <w:rPr>
-          <w:i/>
-        </w:rPr>
-        <w:t>ANALIZA: Bartłomiej, pustelnik ze Służewa, zamieszkuje las Cisek.</w:t>
+        <w:t>• 1477 r. – 12 WŁÓK DLA WSI: Nadane Andrzejowi z Chylina 'koło kaplicy'. To dzisiejsza zabudowa miejscowości.</w:t>
       </w:r>
     </w:p>
     <w:p>
+      <w:pPr>
+        <w:pStyle w:val="Heading1"/>
+      </w:pPr>
       <w:r>
-        <w:rPr>
-          <w:b/>
-        </w:rPr>
-        <w:t xml:space="preserve">1473: </w:t>
-      </w:r>
-      <w:r>
-        <w:t>ks. Bolesław V daje 2 wł. na nowym korzeniu naprzeciw kaplicy Ś. Katarzyny...</w:t>
-        <w:br/>
-      </w:r>
-      <w:r>
-        <w:rPr>
-          <w:i/>
-        </w:rPr>
-        <w:t>ANALIZA: Fundacja uposażenia plebana (poświętne) tuż przy pustelni.</w:t>
-      </w:r>
-    </w:p>
-    <w:p>
-      <w:r>
-        <w:rPr>
-          <w:b/>
-        </w:rPr>
-        <w:t xml:space="preserve">1477: </w:t>
-      </w:r>
-      <w:r>
-        <w:t>ks. Bolesław V daje Andrzejowi z Chylina nowo lokowaną wieś Cz.W. k. kaplicy eremity...</w:t>
-        <w:br/>
-      </w:r>
-      <w:r>
-        <w:rPr>
-          <w:i/>
-        </w:rPr>
-        <w:t>ANALIZA: Lokacja wsi Czarna Wola na 12 włókach otaczających kaplicę.</w:t>
+        <w:t>4. Pozostałe dokumenty (Chronologia)</w:t>
       </w:r>
     </w:p>
     <w:p>
@@ -131,14 +197,7 @@
         <w:t xml:space="preserve">1482: </w:t>
       </w:r>
       <w:r>
-        <w:t>ks. Konrad III daje Maciejowi z Nieksyna 4 wł. i karczmę przy gościńcu do Liwa.</w:t>
-        <w:br/>
-      </w:r>
-      <w:r>
-        <w:rPr>
-          <w:i/>
-        </w:rPr>
-        <w:t>ANALIZA: Ustanowienie karczmy i infrastruktury handlowej na trakcie.</w:t>
+        <w:t>ks. Konrad III daje Maciejowi z Nieksyna karczmę przy gościńcu do Liwa.</w:t>
       </w:r>
     </w:p>
     <w:p>
@@ -146,17 +205,10 @@
         <w:rPr>
           <w:b/>
         </w:rPr>
-        <w:t xml:space="preserve">1526: </w:t>
+        <w:t xml:space="preserve">1504: </w:t>
       </w:r>
       <w:r>
-        <w:t>ks. Anna daje Dorocie brzeg rz. Czarnej z 1/2 stawu i młyna naprzeciw wsi Cz.W.</w:t>
-        <w:br/>
-      </w:r>
-      <w:r>
-        <w:rPr>
-          <w:i/>
-        </w:rPr>
-        <w:t>ANALIZA: Potwierdzenie rzeki Czarnej jako granicy i osi gospodarczej.</w:t>
+        <w:t>Pojawienie się nazwy Pustelnik (P.) jako synonimu Czarnej Woli.</w:t>
       </w:r>
     </w:p>
     <w:p>
@@ -167,14 +219,7 @@
         <w:t xml:space="preserve">1540: </w:t>
       </w:r>
       <w:r>
-        <w:t>Jakub bp płoc. eryguje par. Pustelnik przy istniejącym kościele filialnym Ś. Katarzyny.</w:t>
-        <w:br/>
-      </w:r>
-      <w:r>
-        <w:rPr>
-          <w:i/>
-        </w:rPr>
-        <w:t>ANALIZA: Podniesienie kaplicy do rangi samodzielnej parafii.</w:t>
+        <w:t>Erekcja parafii Pustelnik przez biskupa Jakuba Buczackiego.</w:t>
       </w:r>
     </w:p>
     <w:p>
@@ -185,14 +230,7 @@
         <w:t xml:space="preserve">1775: </w:t>
       </w:r>
       <w:r>
-        <w:t>kośc. zniszczony ze starości, zastępuje go kaplica drew. pw. Ś. Katarzyny.</w:t>
-        <w:br/>
-      </w:r>
-      <w:r>
-        <w:rPr>
-          <w:i/>
-        </w:rPr>
-        <w:t>ANALIZA: Kryzys budowlany i tymczasowa kaplica przed fundacją Grabowskiego.</w:t>
+        <w:t>Wizytacja: kościół zniszczony ze starości, kult w drewnianej kaplicy.</w:t>
       </w:r>
     </w:p>
     <w:p>
@@ -200,18 +238,16 @@
         <w:pStyle w:val="Heading1"/>
       </w:pPr>
       <w:r>
-        <w:t>4. Topografia i Badania</w:t>
+        <w:t>5. Topografia i Badania</w:t>
       </w:r>
     </w:p>
     <w:p>
       <w:r>
-        <w:t>• Trakt Liwski: Pod asfaltem znajdują się historyczne 'kocie łby' (bruk kamienny).</w:t>
-        <w:br/>
-        <w:t>• Lokalizacja kaplicy (1465): Ok. 30-70m od rzeki Czarnej (północny brzeg).</w:t>
+        <w:t>• Trakt Liwski: Pod asfaltem znajdują się historyczne 'kocie łby'.</w:t>
         <w:br/>
         <w:t>• Metoda LIDAR: Kluczowa do znalezienia fundamentów w ogrodzie plebańskim.</w:t>
         <w:br/>
-        <w:t>• Metoda GPR (Georadar): Zalecana wzdłuż ul. Nadrzecznej i Kopernika.</w:t>
+        <w:t>• Lokalizacja: Pierwotna pustelnia stała przy dzisiejszej ul. Nadrzecznej.</w:t>
       </w:r>
     </w:p>
     <w:sectPr>

</xml_diff>

<commit_message>
Integracja analizy pochodzenia eremity Bartłomieja (Służew) do monografii Pustelnika.
Co-authored-by: lindi2k23-eng <285404249+lindi2k23-eng@users.noreply.github.com>
</commit_message>
<xml_diff>
--- a/Analiza_Historyczno-Badawcza_Najnowszego Pustelnika170520266.docx
+++ b/Analiza_Historyczno-Badawcza_Najnowszego Pustelnika170520266.docx
@@ -34,28 +34,26 @@
         <w:pStyle w:val="Heading1"/>
       </w:pPr>
       <w:r>
-        <w:t>2. PEŁNE TŁUMACZENIE AKTU FUNDACYJNEGO (1473 r.)</w:t>
+        <w:t>2. Tożsamość Eremity: Bartłomiej de Slunczew</w:t>
+      </w:r>
+    </w:p>
+    <w:p>
+      <w:r>
+        <w:t>Ważnym odkryciem jest identyfikacja nazwy 'Słuńczew' (Slunczew):</w:t>
+        <w:br/>
+        <w:t>1. SŁUŃCZEW = SŁUŻEW (dzisiejsza dzielnica Warszawy). W XV-wiecznych aktach warszawskich i zakroczymskich nazwa ta odnosi się do Służewa.</w:t>
+        <w:br/>
+        <w:t>2. POWIĄZANIE KULTOWE: Najstarszą parafią na Służewie jest parafia św. Katarzyny (erygowana w 1238 r.). Bartłomiej prawdopodobnie był duchownym ze Służewa, który przeniósł kult swojej patronki w głąb puszczy mazowieckiej.</w:t>
+        <w:br/>
+        <w:t>3. ŚWIĘTA KATARZYNA (Świętokrzyskie): Choć bezpośredni związek z Bodzentynem jest mało prawdopodobny, oba miejsca (Pustelnik i klasztor świętokrzyski) powstały w tym samym czasie (lata 70. XV w.) jako efekt ogólnopolskiej mody na fundowanie ośrodków św. Katarzyny w miejscach odosobnionych.</w:t>
       </w:r>
     </w:p>
     <w:p>
       <w:pPr>
-        <w:pStyle w:val="Heading2"/>
+        <w:pStyle w:val="Heading1"/>
       </w:pPr>
       <w:r>
-        <w:t>Rekonstrukcja Łacińska:</w:t>
-      </w:r>
-    </w:p>
-    <w:p>
-      <w:r>
-        <w:t>Fundus Ecclesiae in Czyszek de cruda radice Anno domini millesimo quadringentesimo [septuagesimo tertio] etc. In Camyenicza feria quarta proxima post Jacobi apostoli... Illustrissimus princeps dominus Boleslaus dux... zelo devotionis accensus volens suae et predecessorum suorum sexus utriusque saluti succurrere... duos mansos mensurae Chulmensis ex opposito oraculi sanctae Katherine penes fluvium Czarna iacentes de cruda radice in Czyszek...</w:t>
-      </w:r>
-    </w:p>
-    <w:p>
-      <w:pPr>
-        <w:pStyle w:val="Heading2"/>
-      </w:pPr>
-      <w:r>
-        <w:t>Tłumaczenie słowo w słowo:</w:t>
+        <w:t>3. PEŁNE TŁUMACZENIE AKTU FUNDACYJNEGO (1473 r.)</w:t>
       </w:r>
     </w:p>
     <w:p>
@@ -78,28 +76,6 @@
       </w:r>
       <w:r>
         <w:t>Roku Pańskiego tysiącznego czterechsetnego (siedemdziesiątego trzeciego).</w:t>
-      </w:r>
-    </w:p>
-    <w:p>
-      <w:r>
-        <w:rPr>
-          <w:b/>
-        </w:rPr>
-        <w:t xml:space="preserve">Illustrissimus princeps dominus Boleslaus dux: </w:t>
-      </w:r>
-      <w:r>
-        <w:t>Najjaśniejszy książę pan Bolesław (V), książę (Mazowsza).</w:t>
-      </w:r>
-    </w:p>
-    <w:p>
-      <w:r>
-        <w:rPr>
-          <w:b/>
-        </w:rPr>
-        <w:t xml:space="preserve">duos mansos mensurae Chulmensis: </w:t>
-      </w:r>
-      <w:r>
-        <w:t>dwie włóki miary chełmińskiej.</w:t>
       </w:r>
     </w:p>
     <w:p>
@@ -136,101 +112,18 @@
       </w:r>
     </w:p>
     <w:p>
+      <w:pPr>
+        <w:pStyle w:val="Heading1"/>
+      </w:pPr>
       <w:r>
-        <w:rPr>
-          <w:b/>
-        </w:rPr>
-        <w:t xml:space="preserve">dedit donavit et largitus est: </w:t>
-      </w:r>
-      <w:r>
-        <w:t>dał, darował i hojnie ofiarował.</w:t>
+        <w:t>4. Podział nadań: Kościół (1473) vs Wieś (1477)</w:t>
       </w:r>
     </w:p>
     <w:p>
       <w:r>
-        <w:rPr>
-          <w:b/>
-        </w:rPr>
-        <w:t xml:space="preserve">absolvit ab omnibus solutionibus: </w:t>
-      </w:r>
-      <w:r>
-        <w:t>uwalnia od wszystkich opłat, czynszów św. Marcina i pańszczyzny.</w:t>
-      </w:r>
-    </w:p>
-    <w:p>
-      <w:r>
-        <w:t>Kluczowe wnioski z aktu:</w:t>
+        <w:t>• 1473 r. – 2 WŁÓKI DLA KOŚCIOŁA: Nadane 'naprzeciw kaplicy'. To dzisiejszy teren plebanii i jej ogrodów.</w:t>
         <w:br/>
-        <w:t>1. Użycie słowa 'ORACULUM' zamiast 'Ecclesia' dla kaplicy św. Katarzyny świadczy o jej pierwotnym, pustelniczym charakterze.</w:t>
-        <w:br/>
-        <w:t>2. Lokalizacja 'PENES FLUVIUM CZARNA' (Przy rzece Czarnej) ostatecznie potwierdza nadrzeczne położenie pierwszej kaplicy.</w:t>
-      </w:r>
-    </w:p>
-    <w:p>
-      <w:pPr>
-        <w:pStyle w:val="Heading1"/>
-      </w:pPr>
-      <w:r>
-        <w:t>3. Podział nadań: Kościół (1473) vs Wieś (1477)</w:t>
-      </w:r>
-    </w:p>
-    <w:p>
-      <w:r>
-        <w:t>• 1473 r. – 2 WŁÓKI DLA KOŚCIOŁA: Nadane 'naprzeciw kaplicy'. To dzisiejsze ogrody plebańskie i teren plebanii.</w:t>
-        <w:br/>
-        <w:t>• 1477 r. – 12 WŁÓK DLA WSI: Nadane Andrzejowi z Chylina 'koło kaplicy'. To dzisiejsza zabudowa miejscowości.</w:t>
-      </w:r>
-    </w:p>
-    <w:p>
-      <w:pPr>
-        <w:pStyle w:val="Heading1"/>
-      </w:pPr>
-      <w:r>
-        <w:t>4. Pozostałe dokumenty (Chronologia)</w:t>
-      </w:r>
-    </w:p>
-    <w:p>
-      <w:r>
-        <w:rPr>
-          <w:b/>
-        </w:rPr>
-        <w:t xml:space="preserve">1482: </w:t>
-      </w:r>
-      <w:r>
-        <w:t>ks. Konrad III daje Maciejowi z Nieksyna karczmę przy gościńcu do Liwa.</w:t>
-      </w:r>
-    </w:p>
-    <w:p>
-      <w:r>
-        <w:rPr>
-          <w:b/>
-        </w:rPr>
-        <w:t xml:space="preserve">1504: </w:t>
-      </w:r>
-      <w:r>
-        <w:t>Pojawienie się nazwy Pustelnik (P.) jako synonimu Czarnej Woli.</w:t>
-      </w:r>
-    </w:p>
-    <w:p>
-      <w:r>
-        <w:rPr>
-          <w:b/>
-        </w:rPr>
-        <w:t xml:space="preserve">1540: </w:t>
-      </w:r>
-      <w:r>
-        <w:t>Erekcja parafii Pustelnik przez biskupa Jakuba Buczackiego.</w:t>
-      </w:r>
-    </w:p>
-    <w:p>
-      <w:r>
-        <w:rPr>
-          <w:b/>
-        </w:rPr>
-        <w:t xml:space="preserve">1775: </w:t>
-      </w:r>
-      <w:r>
-        <w:t>Wizytacja: kościół zniszczony ze starości, kult w drewnianej kaplicy.</w:t>
+        <w:t>• 1477 r. – 12 WŁÓK DLA WSI: Nadane Andrzejowi z Chylina 'koło kaplicy'. To dzisiejszy obszar całej miejscowości.</w:t>
       </w:r>
     </w:p>
     <w:p>

</xml_diff>

<commit_message>
Integracja analizy relacji kaplica-kościół w monografii Pustelnika.
Co-authored-by: lindi2k23-eng <285404249+lindi2k23-eng@users.noreply.github.com>
</commit_message>
<xml_diff>
--- a/Analiza_Historyczno-Badawcza_Najnowszego Pustelnika170520266.docx
+++ b/Analiza_Historyczno-Badawcza_Najnowszego Pustelnika170520266.docx
@@ -34,18 +34,16 @@
         <w:pStyle w:val="Heading1"/>
       </w:pPr>
       <w:r>
-        <w:t>2. Tożsamość Eremity: Bartłomiej de Slunczew</w:t>
+        <w:t>2. Tożsamość Eremity: Bartłomiej de Slunczew (Służew)</w:t>
       </w:r>
     </w:p>
     <w:p>
       <w:r>
-        <w:t>Ważnym odkryciem jest identyfikacja nazwy 'Słuńczew' (Slunczew):</w:t>
+        <w:t>• SŁUŃCZEW = SŁUŻEW (Warszawa): Bartłomiej pochodził z najstarszej mazowieckiej parafii św. Katarzyny na Służewie.</w:t>
         <w:br/>
-        <w:t>1. SŁUŃCZEW = SŁUŻEW (dzisiejsza dzielnica Warszawy). W XV-wiecznych aktach warszawskich i zakroczymskich nazwa ta odnosi się do Służewa.</w:t>
+        <w:t>• PRZENIESIENIE KULTU: To on zaszczepił wezwanie św. Katarzyny w lesie Cisek.</w:t>
         <w:br/>
-        <w:t>2. POWIĄZANIE KULTOWE: Najstarszą parafią na Służewie jest parafia św. Katarzyny (erygowana w 1238 r.). Bartłomiej prawdopodobnie był duchownym ze Służewa, który przeniósł kult swojej patronki w głąb puszczy mazowieckiej.</w:t>
-        <w:br/>
-        <w:t>3. ŚWIĘTA KATARZYNA (Świętokrzyskie): Choć bezpośredni związek z Bodzentynem jest mało prawdopodobny, oba miejsca (Pustelnik i klasztor świętokrzyski) powstały w tym samym czasie (lata 70. XV w.) jako efekt ogólnopolskiej mody na fundowanie ośrodków św. Katarzyny w miejscach odosobnionych.</w:t>
+        <w:t>• KONTEKST: Zbieżność z klasztorem w Górach Świętokrzyskich (fundowanym w tym samym czasie) wynika z ogólnopolskiego renesansu fundacji eremickich.</w:t>
       </w:r>
     </w:p>
     <w:p>
@@ -53,7 +51,28 @@
         <w:pStyle w:val="Heading1"/>
       </w:pPr>
       <w:r>
-        <w:t>3. PEŁNE TŁUMACZENIE AKTU FUNDACYJNEGO (1473 r.)</w:t>
+        <w:t>3. Układ Przestrzenny: Czy stały koło siebie?</w:t>
+      </w:r>
+    </w:p>
+    <w:p>
+      <w:r>
+        <w:t>Analiza wskazuje na ewoluujący kompleks sakralny (Sanctuarium):</w:t>
+        <w:br/>
+        <w:t>• ETAP I (1465): Pierwotna kaplica (Oraculum) Bartłomieja – stała najniżej, przy samej wodzie (ul. Nadrzeczna).</w:t>
+        <w:br/>
+        <w:t>• ETAP II (1540): Kościół parafialny – wzniesiony 'obok' kaplicy, na nieco wyższym terenie (dzisiejsze ogrody plebańskie). Często opisywany jako kościół 'w ogrodzie'.</w:t>
+        <w:br/>
+        <w:t>• ETAP III (1843): Przesunięcie jądra sakralnego na wzgórze (miejsce obecnego kościoła).</w:t>
+        <w:br/>
+        <w:t>Konkluzja: W ogrodach plebańskich znajdują się nakładające się na siebie fundamenty różnych budowli stojących niegdyś obok siebie.</w:t>
+      </w:r>
+    </w:p>
+    <w:p>
+      <w:pPr>
+        <w:pStyle w:val="Heading1"/>
+      </w:pPr>
+      <w:r>
+        <w:t>4. Pełne Tłumaczenie Aktu Fundacyjnego (1473 r.)</w:t>
       </w:r>
     </w:p>
     <w:p>
@@ -72,21 +91,10 @@
         <w:rPr>
           <w:b/>
         </w:rPr>
-        <w:t xml:space="preserve">Anno domini millesimo quadringentesimo [1473]: </w:t>
-      </w:r>
-      <w:r>
-        <w:t>Roku Pańskiego tysiącznego czterechsetnego (siedemdziesiątego trzeciego).</w:t>
-      </w:r>
-    </w:p>
-    <w:p>
-      <w:r>
-        <w:rPr>
-          <w:b/>
-        </w:rPr>
         <w:t xml:space="preserve">ex opposito oraculi sanctae Katherine: </w:t>
       </w:r>
       <w:r>
-        <w:t>naprzeciw kaplicy (oraculum - miejsce modlitwy) świętej Katarzyny.</w:t>
+        <w:t>naprzeciw kaplicy (oraculum) świętej Katarzyny.</w:t>
       </w:r>
     </w:p>
     <w:p>
@@ -108,7 +116,7 @@
         <w:t xml:space="preserve">ratione sanctuarii: </w:t>
       </w:r>
       <w:r>
-        <w:t>z tytułu uposażenia (sanctuarium - poświętnego).</w:t>
+        <w:t>z tytułu uposażenia (poświętnego).</w:t>
       </w:r>
     </w:p>
     <w:p>
@@ -116,14 +124,14 @@
         <w:pStyle w:val="Heading1"/>
       </w:pPr>
       <w:r>
-        <w:t>4. Podział nadań: Kościół (1473) vs Wieś (1477)</w:t>
+        <w:t>5. Podział nadań: Kościół (1473) vs Wieś (1477)</w:t>
       </w:r>
     </w:p>
     <w:p>
       <w:r>
-        <w:t>• 1473 r. – 2 WŁÓKI DLA KOŚCIOŁA: Nadane 'naprzeciw kaplicy'. To dzisiejszy teren plebanii i jej ogrodów.</w:t>
+        <w:t>• 1473 r. (2 włóki): Nadane 'NAPRZECIW' kaplicy. Teren dzisiejszej plebanii (ul. Kopernika).</w:t>
         <w:br/>
-        <w:t>• 1477 r. – 12 WŁÓK DLA WSI: Nadane Andrzejowi z Chylina 'koło kaplicy'. To dzisiejszy obszar całej miejscowości.</w:t>
+        <w:t>• 1477 r. (12 włók): Nadane Andrzejowi z Chylina 'KOŁO' kaplicy. Teren zabudowy wiejskiej.</w:t>
       </w:r>
     </w:p>
     <w:p>
@@ -131,16 +139,16 @@
         <w:pStyle w:val="Heading1"/>
       </w:pPr>
       <w:r>
-        <w:t>5. Topografia i Badania</w:t>
+        <w:t>6. Topografia i Badania</w:t>
       </w:r>
     </w:p>
     <w:p>
       <w:r>
-        <w:t>• Trakt Liwski: Pod asfaltem znajdują się historyczne 'kocie łby'.</w:t>
+        <w:t>• Trakt Liwski: Historyczne 'kocie łby' pod asfaltem.</w:t>
         <w:br/>
-        <w:t>• Metoda LIDAR: Kluczowa do znalezienia fundamentów w ogrodzie plebańskim.</w:t>
+        <w:t>• LIDAR: Szukać fundamentów w pasie od plebanii do rzeki.</w:t>
         <w:br/>
-        <w:t>• Lokalizacja: Pierwotna pustelnia stała przy dzisiejszej ul. Nadrzecznej.</w:t>
+        <w:t>• Archiwa: Wizytacja 1775 (Płock) – opis kościoła i kaplicy stojących obok siebie.</w:t>
       </w:r>
     </w:p>
     <w:sectPr>

</xml_diff>

<commit_message>
Integracja analizy słowiańskiej i lokalizacji dawnego cmentarza do monografii Pustelnika.
Co-authored-by: lindi2k23-eng <285404249+lindi2k23-eng@users.noreply.github.com>
</commit_message>
<xml_diff>
--- a/Analiza_Historyczno-Badawcza_Najnowszego Pustelnika170520266.docx
+++ b/Analiza_Historyczno-Badawcza_Najnowszego Pustelnika170520266.docx
@@ -26,7 +26,7 @@
         <w:br/>
         <w:t>• Rok 1465: Eremita Bartłomiej ze Słuńczewa zasiedla las Cisek. Buduje kaplicę, która staje się 'Punktem Zero'.</w:t>
         <w:br/>
-        <w:t>• Topografia: Kaplica stała na północnym brzegu rzeki Czarnej (rejon dzisiejszej ul. Nadrzecznej).</w:t>
+        <w:t>• SŁUŃCZEW = SŁUŻEW (Warszawa): Bartłomiej prawdopodobnie przeniósł kult św. Katarzyny z jej najstarszego mazowieckiego ośrodka.</w:t>
       </w:r>
     </w:p>
     <w:p>
@@ -34,16 +34,18 @@
         <w:pStyle w:val="Heading1"/>
       </w:pPr>
       <w:r>
-        <w:t>2. Tożsamość Eremity: Bartłomiej de Slunczew (Służew)</w:t>
+        <w:t>2. Układ Przestrzenny i Dawne Cmentarzysko</w:t>
       </w:r>
     </w:p>
     <w:p>
       <w:r>
-        <w:t>• SŁUŃCZEW = SŁUŻEW (Warszawa): Bartłomiej pochodził z najstarszej mazowieckiej parafii św. Katarzyny na Służewie.</w:t>
+        <w:t>Analiza wskazuje na rygorystyczny układ symboliczny (Wschód-Zachód):</w:t>
         <w:br/>
-        <w:t>• PRZENIESIENIE KULTU: To on zaszczepił wezwanie św. Katarzyny w lesie Cisek.</w:t>
+        <w:t>• PLEBANIA (ZACHÓD): Miejsce życia, dom plebana nadany 'naprzeciw' kaplicy w 1473 r.</w:t>
         <w:br/>
-        <w:t>• KONTEKST: Zbieżność z klasztorem w Górach Świętokrzyskich (fundowanym w tym samym czasie) wynika z ogólnopolskiego renesansu fundacji eremickich.</w:t>
+        <w:t>• OGRÓD PLEBAŃSKI (ŚRODEK): Tu znajdował się NAJSTARSZY CMENTARZ (XV–XVIII w.). Zanim w 1840 r. założono obecny cmentarz, mieszkańców chowano wokół kościoła, czyli właśnie w pasie ogrodu między plebanią a rzeką.</w:t>
+        <w:br/>
+        <w:t>• KOŚCIÓŁ/KAPLICA (WSCHÓD): Świątynia zorientowana na wschód (symbol zmartwychwstania), położona bliżej rzeki Czarnej.</w:t>
       </w:r>
     </w:p>
     <w:p>
@@ -51,20 +53,18 @@
         <w:pStyle w:val="Heading1"/>
       </w:pPr>
       <w:r>
-        <w:t>3. Układ Przestrzenny: Czy stały koło siebie?</w:t>
+        <w:t>3. Korzenie Słowiańskie i Mitologia Miejsca</w:t>
       </w:r>
     </w:p>
     <w:p>
       <w:r>
-        <w:t>Analiza wskazuje na ewoluujący kompleks sakralny (Sanctuarium):</w:t>
+        <w:t>Pustelnik i jego okolice kryją nazwy o głębokim rodowodzie słowiańskim:</w:t>
         <w:br/>
-        <w:t>• ETAP I (1465): Pierwotna kaplica (Oraculum) Bartłomieja – stała najniżej, przy samej wodzie (ul. Nadrzeczna).</w:t>
+        <w:t>1. DZIADOSZ (Dziadoszu): Etymologia bezpośrednio związana ze słowiańskim 'Dziadem' (przodkiem, duchem opiekuńczym) oraz obrzędem DZIADÓW. Może sugerować dawne miejsce kultu przodków.</w:t>
         <w:br/>
-        <w:t>• ETAP II (1540): Kościół parafialny – wzniesiony 'obok' kaplicy, na nieco wyższym terenie (dzisiejsze ogrody plebańskie). Często opisywany jako kościół 'w ogrodzie'.</w:t>
+        <w:t>2. CISEK (Czyszek): Od CISA – drzewa świętego i magicznego w wierzeniach Słowian, symbolu nieśmiertelności i związku ze światem zmarłych.</w:t>
         <w:br/>
-        <w:t>• ETAP III (1843): Przesunięcie jądra sakralnego na wzgórze (miejsce obecnego kościoła).</w:t>
-        <w:br/>
-        <w:t>Konkluzja: W ogrodach plebańskich znajdują się nakładające się na siebie fundamenty różnych budowli stojących niegdyś obok siebie.</w:t>
+        <w:t>3. RZEKA CZARNA: W mitologii słowiańskiej nazwa ta często oznaczała granicę między światem żywych a krainą cieni (zaświatami).</w:t>
       </w:r>
     </w:p>
     <w:p>
@@ -94,7 +94,7 @@
         <w:t xml:space="preserve">ex opposito oraculi sanctae Katherine: </w:t>
       </w:r>
       <w:r>
-        <w:t>naprzeciw kaplicy (oraculum) świętej Katarzyny.</w:t>
+        <w:t>naprzeciw kaplicy (oraculum - miejsce modlitwy) świętej Katarzyny.</w:t>
       </w:r>
     </w:p>
     <w:p>
@@ -105,7 +105,7 @@
         <w:t xml:space="preserve">penes fluvium Czarna iacentes: </w:t>
       </w:r>
       <w:r>
-        <w:t>przy rzece Czarnej leżące.</w:t>
+        <w:t>przy rzece Czarnej leżące (potwierdzenie lokalizacji kaplicy).</w:t>
       </w:r>
     </w:p>
     <w:p>
@@ -116,7 +116,7 @@
         <w:t xml:space="preserve">ratione sanctuarii: </w:t>
       </w:r>
       <w:r>
-        <w:t>z tytułu uposażenia (poświętnego).</w:t>
+        <w:t>z tytułu uposażenia (sanctuarium - poświętnego).</w:t>
       </w:r>
     </w:p>
     <w:p>
@@ -124,14 +124,14 @@
         <w:pStyle w:val="Heading1"/>
       </w:pPr>
       <w:r>
-        <w:t>5. Podział nadań: Kościół (1473) vs Wieś (1477)</w:t>
+        <w:t>5. Struktura Gruntowa: Podział 1473 / 1477</w:t>
       </w:r>
     </w:p>
     <w:p>
       <w:r>
-        <w:t>• 1473 r. (2 włóki): Nadane 'NAPRZECIW' kaplicy. Teren dzisiejszej plebanii (ul. Kopernika).</w:t>
+        <w:t>• 1473 r. (2 włóki): Jądro kościelne 'naprzeciw kaplicy' – dzisiejsze siedlisko plebańskie.</w:t>
         <w:br/>
-        <w:t>• 1477 r. (12 włók): Nadane Andrzejowi z Chylina 'KOŁO' kaplicy. Teren zabudowy wiejskiej.</w:t>
+        <w:t>• 1477 r. (12 włók): Lokacja wsi 'koło kaplicy' – teren zabudowy wiejskiej (kmiecej).</w:t>
       </w:r>
     </w:p>
     <w:p>
@@ -139,16 +139,16 @@
         <w:pStyle w:val="Heading1"/>
       </w:pPr>
       <w:r>
-        <w:t>6. Topografia i Badania</w:t>
+        <w:t>6. Jak szukać fundamentów i grobów?</w:t>
       </w:r>
     </w:p>
     <w:p>
       <w:r>
-        <w:t>• Trakt Liwski: Historyczne 'kocie łby' pod asfaltem.</w:t>
+        <w:t>1. LIDAR (Geoportal): Szukać śladów fundamentów starego kościoła 'w ogrodzie'.</w:t>
         <w:br/>
-        <w:t>• LIDAR: Szukać fundamentów w pasie od plebanii do rzeki.</w:t>
+        <w:t>2. GEORADAR: Zalecany w ogrodzie plebańskim w celu lokalizacji najstarszych pochówków (XV–XVIII w.) oraz fundamentów pierwszej kaplicy.</w:t>
         <w:br/>
-        <w:t>• Archiwa: Wizytacja 1775 (Płock) – opis kościoła i kaplicy stojących obok siebie.</w:t>
+        <w:t>3. ARCHEOLOGIA: Wschodnia część ogrodu (bliżej rzeki) jest najbardziej obiecująca pod względem znalezisk słowiańskich i wczesnochrześcijańskich.</w:t>
       </w:r>
     </w:p>
     <w:sectPr>

</xml_diff>

<commit_message>
Pełna monografia Pustelnika z podziałem rzeki i wyjaśnieniem roli Zakroczymia.
Co-authored-by: lindi2k23-eng <285404249+lindi2k23-eng@users.noreply.github.com>
</commit_message>
<xml_diff>
--- a/Analiza_Historyczno-Badawcza_Najnowszego Pustelnika170520266.docx
+++ b/Analiza_Historyczno-Badawcza_Najnowszego Pustelnika170520266.docx
@@ -15,18 +15,16 @@
         <w:pStyle w:val="Heading1"/>
       </w:pPr>
       <w:r>
-        <w:t>1. Fundamenty: 1440, 1465 i Kaplica św. Katarzyny</w:t>
+        <w:t>1. Początki: Eremita Bartłomiej i Zagadka Chronologii</w:t>
       </w:r>
     </w:p>
     <w:p>
       <w:r>
-        <w:t>Kluczowe dla zrozumienia Pustelnika jest rozróżnienie między tradycją a dokumentami:</w:t>
+        <w:t>• Rok 1440: Pierwotny zamysł fundacyjny (Bolesław IV). Ziemia zarezerwowana w puszczy.</w:t>
         <w:br/>
-        <w:t>• Rok 1440: Moment 'papierowej' fundacji (Bolesław IV). Ziemia wyznaczona w puszczy, ale bez osadników.</w:t>
+        <w:t>• Rok 1465: Eremita Bartłomiej ze Słuńczewa zasiedla teren. Buduje kaplicę św. Katarzyny.</w:t>
         <w:br/>
-        <w:t>• Rok 1465: Eremita Bartłomiej ze Słuńczewa zasiedla las Cisek. Buduje kaplicę, która staje się 'Punktem Zero'.</w:t>
-        <w:br/>
-        <w:t>• SŁUŃCZEW = SŁUŻEW (Warszawa): Bartłomiej prawdopodobnie przeniósł kult św. Katarzyny z jej najstarszego mazowieckiego ośrodka.</w:t>
+        <w:t>• KIM BYŁ BARTŁOMIEJ? Pochodził ze Słuńczewa (dzisiejszy warszawski SŁUŻEW). Służew był centrum kultu św. Katarzyny (parafia od 1238 r.), skąd Bartłomiej przeniósł wezwanie do Pustelnika.</w:t>
       </w:r>
     </w:p>
     <w:p>
@@ -34,18 +32,16 @@
         <w:pStyle w:val="Heading1"/>
       </w:pPr>
       <w:r>
-        <w:t>2. Układ Przestrzenny i Dawne Cmentarzysko</w:t>
+        <w:t>2. Ślady Biurokratyczne: Dlaczego Służew jest w Księgach Zakroczymskich?</w:t>
       </w:r>
     </w:p>
     <w:p>
       <w:r>
-        <w:t>Analiza wskazuje na rygorystyczny układ symboliczny (Wschód-Zachód):</w:t>
+        <w:t>Pojawienie się zapisów o Słuńczewie/Służewie (Ziemia Warszawska) w Księgach Zakroczymskich wynika z:</w:t>
         <w:br/>
-        <w:t>• PLEBANIA (ZACHÓD): Miejsce życia, dom plebana nadany 'naprzeciw' kaplicy w 1473 r.</w:t>
+        <w:t>1. MOBILNOŚCI SĄDÓW: Książęta mazowieccy podróżowali z sądem objazdowym. Akty wpisywano do ksiąg miejsca, w którym akurat przebywał władca (np. w Zakroczymiu).</w:t>
         <w:br/>
-        <w:t>• OGRÓD PLEBAŃSKI (ŚRODEK): Tu znajdował się NAJSTARSZY CMENTARZ (XV–XVIII w.). Zanim w 1840 r. założono obecny cmentarz, mieszkańców chowano wokół kościoła, czyli właśnie w pasie ogrodu między plebanią a rzeką.</w:t>
-        <w:br/>
-        <w:t>• KOŚCIÓŁ/KAPLICA (WSCHÓD): Świątynia zorientowana na wschód (symbol zmartwychwstania), położona bliżej rzeki Czarnej.</w:t>
+        <w:t>2. RANGI WYDARZENIA: Lokacja Pustelnika była sprawą państwową, rejestrowaną w najważniejszych księgach książęcych, niezależnie od granic powiatów.</w:t>
       </w:r>
     </w:p>
     <w:p>
@@ -53,18 +49,32 @@
         <w:pStyle w:val="Heading1"/>
       </w:pPr>
       <w:r>
-        <w:t>3. Korzenie Słowiańskie i Mitologia Miejsca</w:t>
+        <w:t>3. Układ Przestrzenny: Podział przez rzekę Czarną</w:t>
       </w:r>
     </w:p>
     <w:p>
       <w:r>
-        <w:t>Pustelnik i jego okolice kryją nazwy o głębokim rodowodzie słowiańskim:</w:t>
+        <w:rPr>
+          <w:b/>
+        </w:rPr>
+        <w:t>Rzeka Czarna stanowi historyczną i topograficzną oś Pustelnika:</w:t>
+      </w:r>
+    </w:p>
+    <w:p>
+      <w:r>
+        <w:t>• WSCHODNI BRZEG (Rejon dzisiejszej ul. Kopernika/Nadrzecznej):</w:t>
         <w:br/>
-        <w:t>1. DZIADOSZ (Dziadoszu): Etymologia bezpośrednio związana ze słowiańskim 'Dziadem' (przodkiem, duchem opiekuńczym) oraz obrzędem DZIADÓW. Może sugerować dawne miejsce kultu przodków.</w:t>
+        <w:t>Tu prawdopodobnie stała PIERWOTNA KAPLICA Bartłomieja (1465 r.). Było to miejsce najbliżej wody, serce pustelni.</w:t>
         <w:br/>
-        <w:t>2. CISEK (Czyszek): Od CISA – drzewa świętego i magicznego w wierzeniach Słowian, symbolu nieśmiertelności i związku ze światem zmarłych.</w:t>
         <w:br/>
-        <w:t>3. RZEKA CZARNA: W mitologii słowiańskiej nazwa ta często oznaczała granicę między światem żywych a krainą cieni (zaświatami).</w:t>
+        <w:t>• ZACHODNI BRZEG (Miejsce dzisiejszej Plebanii):</w:t>
+        <w:br/>
+        <w:t>To jest teren nadany 'NAPRZECIW KAPLICY' (ex opposito) w 1473 r. Pleban Maciej (1482 r.) wybudował tu swój dom na suchym wzniesieniu, oddzielając się rzeką od reszty wsi.</w:t>
+        <w:br/>
+        <w:br/>
+        <w:t>• OGRÓD PLEBAŃSKI (Zachodni brzeg):</w:t>
+        <w:br/>
+        <w:t>Miejsce lokalizacji starego kościoła (sprzed 1840 r.) oraz NAJSTARSZEGO CMENTARZA (XV-XVIII w.).</w:t>
       </w:r>
     </w:p>
     <w:p>
@@ -72,7 +82,39 @@
         <w:pStyle w:val="Heading1"/>
       </w:pPr>
       <w:r>
-        <w:t>4. Pełne Tłumaczenie Aktu Fundacyjnego (1473 r.)</w:t>
+        <w:t>4. Struktura Gruntowa: 2 włóki vs 12 włók</w:t>
+      </w:r>
+    </w:p>
+    <w:p>
+      <w:r>
+        <w:t>• 1473 r. (2 włóki): Majątek kościelny (Sanctuarium) nadany 'naprzeciw kaplicy' – dzisiejsza strona zachodnia (Plebania).</w:t>
+        <w:br/>
+        <w:t>• 1477 r. (12 włók): Majątek wiejski nadany Andrzejowi z Chylina – teren dzisiejszej wsi otaczający kaplicę.</w:t>
+      </w:r>
+    </w:p>
+    <w:p>
+      <w:pPr>
+        <w:pStyle w:val="Heading1"/>
+      </w:pPr>
+      <w:r>
+        <w:t>5. Dziedzictwo Słowiańskie</w:t>
+      </w:r>
+    </w:p>
+    <w:p>
+      <w:r>
+        <w:t>1. DZIADOSZ: Związek z obrzędem 'Dziadów' i kultem przodków.</w:t>
+        <w:br/>
+        <w:t>2. CISEK: Cis jako święte drzewo Słowian (symbol wieczności i zaświatów).</w:t>
+        <w:br/>
+        <w:t>3. RZEKA CZARNA: Mitologiczna granica między światami.</w:t>
+      </w:r>
+    </w:p>
+    <w:p>
+      <w:pPr>
+        <w:pStyle w:val="Heading1"/>
+      </w:pPr>
+      <w:r>
+        <w:t>6. Akt Fundacyjny 1473 r. - Pełne Tłumaczenie</w:t>
       </w:r>
     </w:p>
     <w:p>
@@ -83,7 +125,7 @@
         <w:t xml:space="preserve">Fundus Ecclesiae in Czyszek de cruda radice: </w:t>
       </w:r>
       <w:r>
-        <w:t>Fundacja Kościoła w Cisku na surowym korzeniu (wykarczowanym).</w:t>
+        <w:t>Fundacja Kościoła w Cisku na surowym korzeniu.</w:t>
       </w:r>
     </w:p>
     <w:p>
@@ -94,7 +136,7 @@
         <w:t xml:space="preserve">ex opposito oraculi sanctae Katherine: </w:t>
       </w:r>
       <w:r>
-        <w:t>naprzeciw kaplicy (oraculum - miejsce modlitwy) świętej Katarzyny.</w:t>
+        <w:t>naprzeciw kaplicy (miejsca modlitwy) świętej Katarzyny.</w:t>
       </w:r>
     </w:p>
     <w:p>
@@ -105,7 +147,7 @@
         <w:t xml:space="preserve">penes fluvium Czarna iacentes: </w:t>
       </w:r>
       <w:r>
-        <w:t>przy rzece Czarnej leżące (potwierdzenie lokalizacji kaplicy).</w:t>
+        <w:t>przy rzece Czarnej leżące.</w:t>
       </w:r>
     </w:p>
     <w:p>
@@ -116,7 +158,7 @@
         <w:t xml:space="preserve">ratione sanctuarii: </w:t>
       </w:r>
       <w:r>
-        <w:t>z tytułu uposażenia (sanctuarium - poświętnego).</w:t>
+        <w:t>z tytułu uposażenia (poświętnego).</w:t>
       </w:r>
     </w:p>
     <w:p>
@@ -124,31 +166,16 @@
         <w:pStyle w:val="Heading1"/>
       </w:pPr>
       <w:r>
-        <w:t>5. Struktura Gruntowa: Podział 1473 / 1477</w:t>
+        <w:t>7. Przewodnik dla Badacza</w:t>
       </w:r>
     </w:p>
     <w:p>
       <w:r>
-        <w:t>• 1473 r. (2 włóki): Jądro kościelne 'naprzeciw kaplicy' – dzisiejsze siedlisko plebańskie.</w:t>
+        <w:t>• LIDAR: Szukać fundamentów 'w ogrodzie' na zachodnim brzegu.</w:t>
         <w:br/>
-        <w:t>• 1477 r. (12 włók): Lokacja wsi 'koło kaplicy' – teren zabudowy wiejskiej (kmiecej).</w:t>
-      </w:r>
-    </w:p>
-    <w:p>
-      <w:pPr>
-        <w:pStyle w:val="Heading1"/>
-      </w:pPr>
-      <w:r>
-        <w:t>6. Jak szukać fundamentów i grobów?</w:t>
-      </w:r>
-    </w:p>
-    <w:p>
-      <w:r>
-        <w:t>1. LIDAR (Geoportal): Szukać śladów fundamentów starego kościoła 'w ogrodzie'.</w:t>
+        <w:t>• GEORADAR: Zalecany przy ul. Nadrzecznej (wschodni brzeg - stara kaplica) oraz w ogrodzie plebańskim (zachodni brzeg - kościół i cmentarz).</w:t>
         <w:br/>
-        <w:t>2. GEORADAR: Zalecany w ogrodzie plebańskim w celu lokalizacji najstarszych pochówków (XV–XVIII w.) oraz fundamentów pierwszej kaplicy.</w:t>
-        <w:br/>
-        <w:t>3. ARCHEOLOGIA: Wschodnia część ogrodu (bliżej rzeki) jest najbardziej obiecująca pod względem znalezisk słowiańskich i wczesnochrześcijańskich.</w:t>
+        <w:t>• TRAKT: Pod asfaltem 'kocie łby' (bruk XIX-wieczny).</w:t>
       </w:r>
     </w:p>
     <w:sectPr>

</xml_diff>